<commit_message>
Agrega evidencias individuales Fase 2 de Diego Madrid (2.1 y 2.2).
Actualiza informe grupal 2.3 con reflexion Diego y TC-064 Kozen 13/10.

Co-authored-by: Cursor <cursoragent@cursor.com>
</commit_message>
<xml_diff>
--- a/fase2/Evidencias Grupales/2.3_APT122_InformeAvance_DPAY3_Fase 2.docx
+++ b/fase2/Evidencias Grupales/2.3_APT122_InformeAvance_DPAY3_Fase 2.docx
@@ -8486,28 +8486,7 @@
         <w:spacing w:after="60"/>
       </w:pPr>
       <w:r>
-        <w:rPr>
-          <w:b/>
-        </w:rPr>
-        <w:t xml:space="preserve">Regresión TUU/Kozen (TC-064): </w:t>
-      </w:r>
-      <w:r>
-        <w:rPr>
-          <w:bCs/>
-        </w:rPr>
-        <w:t xml:space="preserve">Bloqueado: en espera de ejecución </w:t>
-      </w:r>
-      <w:r>
-        <w:rPr>
-          <w:bCs/>
-        </w:rPr>
-        <w:t xml:space="preserve">con </w:t>
-      </w:r>
-      <w:r>
-        <w:rPr>
-          <w:bCs/>
-        </w:rPr>
-        <w:t>TUU/Kozen en producción.</w:t>
+        <w:t>Regresión TUU/Kozen (TC-064 / TC-RG-01): ejecutada 13/10/2026 en Kozen P8 Neo por Diego Madrid; evidencia en 07_Plan_de_Pruebas/05_Evidencias_por_sprint/Sprint_03/capturas_20261013/.</w:t>
       </w:r>
     </w:p>
     <w:p>
@@ -10006,7 +9985,7 @@
         <w:jc w:val="both"/>
       </w:pPr>
       <w:r>
-        <w:t>The inherited POS still sells in cash and the new gateway layer does not break that path. Design and deployment notes (documents 05 and 08) must stay aligned with the LAN proxy and the C:\dpay build copy so a classmate can reproduce the celular Android demo. DTE and tbl_dpay for Webpay are the next construction target, not a claim in this report.</w:t>
+        <w:t>By 15 October 2026 the gateway layer keeps cash sales and production TUU behaviour intact while adding Webpay on a generic Android phone. Documents 05 (SAD v1.0.2) and 08 (deployment manual) are uploaded to Drive and must stay aligned with the LAN proxy (port 8787), Metro (8081 with adb reverse) and the short Windows build copy C:\\p\\a so anyone can reproduce demos. On 13 October I executed TUU/Kozen regression on the P8 Neo; eight screenshots live under 07_Plan_de_Pruebas/05_Evidencias_por_sprint/Sprint_03/capturas_20261013/. DTE and tbl_dpay registration for Webpay remain construction targets for Sprint 3, not claims in this report. Official checkout timeout: 300 s.</w:t>
       </w:r>
     </w:p>
     <w:p>
@@ -10026,7 +10005,7 @@
         <w:jc w:val="both"/>
       </w:pPr>
       <w:r>
-        <w:t>Splitting design and the deployment manual from QA documents made ownership visible. The remaining risk is documentation drift if the proxy URL or timeout changes again without updating document 08.</w:t>
+        <w:t>Owning design and deployment documentation means every architecture decision has to match a path in Git and a step a teammate can run on Windows. The hardest friction was environmental—Gradle path limits and forgetting USB reverse for Metro—not missing product features. The Kozen session proved the production TUU path still works inside PaymentGateway. My remaining risk is documentation drift: if the proxy URL or timeout changes again, document 08 must be updated in the same sprint. With Pablo Gutiérrez I will keep publishing actas and Word deliverables through PR #17 instead of leaving Drive copies orphaned from main.</w:t>
       </w:r>
     </w:p>
     <w:p>

</xml_diff>